<commit_message>
feat: initialize frontend with Next.js, Tailwind CSS, and Zustand for state management
- Add package.json for frontend dependencies and scripts
- Create postcss.config.js for Tailwind CSS integration
- Implement Zustand store (simStore.js) for managing simulation state
- Set up Tailwind CSS configuration (tailwind.config.js) with custom theme
- Add main package.json for managing backend and frontend scripts
- Create reusable card component in Streamlit (components.py)
- Define global styles in theme.css for consistent UI design

Co-authored-by: izam042 <izam42314@gmail.com>
</commit_message>
<xml_diff>
--- a/ResilienceSim_ProjectPlan.docx
+++ b/ResilienceSim_ProjectPlan.docx
@@ -8808,6 +8808,11 @@
       <w:pgNumType/>
       <w:docGrid w:linePitch="360"/>
     </w:sectPr>
+    <w:p>
+      <w:r>
+        <w:t>Update March 2026: PHASE CP - Country Profiles (between Phase 3 and Phase 4) is COMPLETE. Deliverables include engine/country.py, data/countries JSON profiles, per-nation profile application at scenario load, runtime alliance and terrain modifiers, the Country Setup page, simulation profile summaries, and dedicated automated tests.</w:t>
+      </w:r>
+    </w:p>
   </w:body>
 </w:document>
 </file>

</xml_diff>